<commit_message>
SimpleTideFilter v.3 (with DEARPYGUI) minor changes - working; 01/08/2026
</commit_message>
<xml_diff>
--- a/project/_man/manual.docx
+++ b/project/_man/manual.docx
@@ -15,16 +15,23 @@
       <w:pPr>
         <w:pStyle w:val="Heading1"/>
       </w:pPr>
+      <w:proofErr w:type="spellStart"/>
       <w:r>
         <w:t>SimpleTideFilter</w:t>
       </w:r>
+      <w:proofErr w:type="spellEnd"/>
     </w:p>
     <w:p>
       <w:pPr>
         <w:jc w:val="both"/>
       </w:pPr>
-      <w:r>
-        <w:t xml:space="preserve">SimpleTideFilter application was developed to </w:t>
+      <w:proofErr w:type="spellStart"/>
+      <w:r>
+        <w:t>SimpleTideFilter</w:t>
+      </w:r>
+      <w:proofErr w:type="spellEnd"/>
+      <w:r>
+        <w:t xml:space="preserve"> application was developed to </w:t>
       </w:r>
       <w:r>
         <w:t xml:space="preserve">simplify and </w:t>
@@ -48,7 +55,15 @@
         <w:t xml:space="preserve"> environment</w:t>
       </w:r>
       <w:r>
-        <w:t>. With SimpleTideFilter it is possible to:</w:t>
+        <w:t xml:space="preserve">. With </w:t>
+      </w:r>
+      <w:proofErr w:type="spellStart"/>
+      <w:r>
+        <w:t>SimpleTideFilter</w:t>
+      </w:r>
+      <w:proofErr w:type="spellEnd"/>
+      <w:r>
+        <w:t xml:space="preserve"> it is possible to:</w:t>
       </w:r>
     </w:p>
     <w:p>
@@ -209,7 +224,15 @@
       </w:r>
       <w:r>
         <w:lastRenderedPageBreak/>
-        <w:t xml:space="preserve">should be removed from the files. For example, Qinsy acquisition software adds multiple header lines in the </w:t>
+        <w:t xml:space="preserve">should be removed from the files. For example, </w:t>
+      </w:r>
+      <w:proofErr w:type="spellStart"/>
+      <w:r>
+        <w:t>Qinsy</w:t>
+      </w:r>
+      <w:proofErr w:type="spellEnd"/>
+      <w:r>
+        <w:t xml:space="preserve"> acquisition software adds multiple header lines in the </w:t>
       </w:r>
       <w:r>
         <w:t xml:space="preserve">RTK tide </w:t>
@@ -339,7 +362,15 @@
               <w:jc w:val="both"/>
             </w:pPr>
             <w:r>
-              <w:t>06/04/2026,00:00:00,-0.19</w:t>
+              <w:t>06/04/2026,00:00:</w:t>
+            </w:r>
+            <w:proofErr w:type="gramStart"/>
+            <w:r>
+              <w:t>00,-</w:t>
+            </w:r>
+            <w:proofErr w:type="gramEnd"/>
+            <w:r>
+              <w:t>0.19</w:t>
             </w:r>
           </w:p>
         </w:tc>
@@ -351,9 +382,16 @@
             <w:pPr>
               <w:jc w:val="both"/>
             </w:pPr>
-            <w:r>
-              <w:t>Date,Time,Tide</w:t>
-            </w:r>
+            <w:proofErr w:type="spellStart"/>
+            <w:proofErr w:type="gramStart"/>
+            <w:r>
+              <w:t>Date,Time</w:t>
+            </w:r>
+            <w:proofErr w:type="gramEnd"/>
+            <w:r>
+              <w:t>,Tide</w:t>
+            </w:r>
+            <w:proofErr w:type="spellEnd"/>
           </w:p>
         </w:tc>
       </w:tr>
@@ -394,9 +432,16 @@
             <w:pPr>
               <w:jc w:val="both"/>
             </w:pPr>
-            <w:r>
-              <w:t>Date,Time,Tide</w:t>
-            </w:r>
+            <w:proofErr w:type="spellStart"/>
+            <w:proofErr w:type="gramStart"/>
+            <w:r>
+              <w:t>Date,Time</w:t>
+            </w:r>
+            <w:proofErr w:type="gramEnd"/>
+            <w:r>
+              <w:t>,Tide</w:t>
+            </w:r>
+            <w:proofErr w:type="spellEnd"/>
           </w:p>
         </w:tc>
       </w:tr>
@@ -410,7 +455,15 @@
               <w:jc w:val="both"/>
             </w:pPr>
             <w:r>
-              <w:t>06/04/2026,00:00:00,-0.19</w:t>
+              <w:t>06/04/2026,00:00:</w:t>
+            </w:r>
+            <w:proofErr w:type="gramStart"/>
+            <w:r>
+              <w:t>00,-</w:t>
+            </w:r>
+            <w:proofErr w:type="gramEnd"/>
+            <w:r>
+              <w:t>0.19</w:t>
             </w:r>
             <w:r>
               <w:t>,000,111,222</w:t>
@@ -425,9 +478,29 @@
             <w:pPr>
               <w:jc w:val="both"/>
             </w:pPr>
-            <w:r>
-              <w:t>Date,Time,Tide,A,B,C</w:t>
-            </w:r>
+            <w:proofErr w:type="spellStart"/>
+            <w:proofErr w:type="gramStart"/>
+            <w:r>
+              <w:t>Date,Time</w:t>
+            </w:r>
+            <w:proofErr w:type="gramEnd"/>
+            <w:r>
+              <w:t>,</w:t>
+            </w:r>
+            <w:proofErr w:type="gramStart"/>
+            <w:r>
+              <w:t>Tide,A</w:t>
+            </w:r>
+            <w:proofErr w:type="gramEnd"/>
+            <w:r>
+              <w:t>,</w:t>
+            </w:r>
+            <w:proofErr w:type="gramStart"/>
+            <w:r>
+              <w:t>B,C</w:t>
+            </w:r>
+            <w:proofErr w:type="spellEnd"/>
+            <w:proofErr w:type="gramEnd"/>
           </w:p>
         </w:tc>
       </w:tr>
@@ -619,7 +692,15 @@
               <w:jc w:val="both"/>
             </w:pPr>
             <w:r>
-              <w:t>%d:%m:%Y</w:t>
+              <w:t>%</w:t>
+            </w:r>
+            <w:proofErr w:type="gramStart"/>
+            <w:r>
+              <w:t>d:%m:%</w:t>
+            </w:r>
+            <w:proofErr w:type="gramEnd"/>
+            <w:r>
+              <w:t>Y</w:t>
             </w:r>
           </w:p>
         </w:tc>
@@ -702,7 +783,15 @@
               <w:jc w:val="both"/>
             </w:pPr>
             <w:r>
-              <w:t>%H:%M:%S</w:t>
+              <w:t>%</w:t>
+            </w:r>
+            <w:proofErr w:type="gramStart"/>
+            <w:r>
+              <w:t>H:%M:%</w:t>
+            </w:r>
+            <w:proofErr w:type="gramEnd"/>
+            <w:r>
+              <w:t>S</w:t>
             </w:r>
           </w:p>
         </w:tc>
@@ -730,7 +819,16 @@
               <w:jc w:val="both"/>
             </w:pPr>
             <w:r>
-              <w:t>%H:%M:%S</w:t>
+              <w:t>%</w:t>
+            </w:r>
+            <w:proofErr w:type="gramStart"/>
+            <w:r>
+              <w:t>H:%M:%</w:t>
+            </w:r>
+            <w:proofErr w:type="spellStart"/>
+            <w:proofErr w:type="gramEnd"/>
+            <w:r>
+              <w:t>S</w:t>
             </w:r>
             <w:r>
               <w:t>.</w:t>
@@ -738,6 +836,7 @@
             <w:r>
               <w:t>%f</w:t>
             </w:r>
+            <w:proofErr w:type="spellEnd"/>
           </w:p>
         </w:tc>
       </w:tr>
@@ -764,7 +863,16 @@
               <w:jc w:val="both"/>
             </w:pPr>
             <w:r>
-              <w:t>%H:%M:%S</w:t>
+              <w:t>%</w:t>
+            </w:r>
+            <w:proofErr w:type="gramStart"/>
+            <w:r>
+              <w:t>H:%M:%</w:t>
+            </w:r>
+            <w:proofErr w:type="spellStart"/>
+            <w:proofErr w:type="gramEnd"/>
+            <w:r>
+              <w:t>S</w:t>
             </w:r>
             <w:r>
               <w:t>.</w:t>
@@ -772,6 +880,7 @@
             <w:r>
               <w:t>%f</w:t>
             </w:r>
+            <w:proofErr w:type="spellEnd"/>
           </w:p>
         </w:tc>
       </w:tr>
@@ -798,7 +907,16 @@
               <w:jc w:val="both"/>
             </w:pPr>
             <w:r>
-              <w:t>%H:%M:%S</w:t>
+              <w:t>%</w:t>
+            </w:r>
+            <w:proofErr w:type="gramStart"/>
+            <w:r>
+              <w:t>H:%M:%</w:t>
+            </w:r>
+            <w:proofErr w:type="spellStart"/>
+            <w:proofErr w:type="gramEnd"/>
+            <w:r>
+              <w:t>S</w:t>
             </w:r>
             <w:r>
               <w:t>.</w:t>
@@ -806,6 +924,7 @@
             <w:r>
               <w:t>%f</w:t>
             </w:r>
+            <w:proofErr w:type="spellEnd"/>
           </w:p>
         </w:tc>
       </w:tr>
@@ -850,14 +969,31 @@
         <w:jc w:val="both"/>
       </w:pPr>
       <w:r>
-        <w:t>Once loaded, data may be decimated in order to reduce redundant data by selecting ‘</w:t>
-      </w:r>
+        <w:t xml:space="preserve">Once loaded, data may be decimated </w:t>
+      </w:r>
+      <w:proofErr w:type="gramStart"/>
+      <w:r>
+        <w:t>in order to</w:t>
+      </w:r>
+      <w:proofErr w:type="gramEnd"/>
+      <w:r>
+        <w:t xml:space="preserve"> reduce redundant data by selecting ‘</w:t>
+      </w:r>
+      <w:proofErr w:type="spellStart"/>
       <w:r>
         <w:rPr>
           <w:b/>
           <w:bCs/>
         </w:rPr>
-        <w:t>Downsample rate</w:t>
+        <w:t>Downsample</w:t>
+      </w:r>
+      <w:proofErr w:type="spellEnd"/>
+      <w:r>
+        <w:rPr>
+          <w:b/>
+          <w:bCs/>
+        </w:rPr>
+        <w:t xml:space="preserve"> rate</w:t>
       </w:r>
       <w:r>
         <w:t>’ (every n</w:t>
@@ -1164,6 +1300,22 @@
     <w:p>
       <w:pPr>
         <w:jc w:val="both"/>
+        <w:rPr>
+          <w:b/>
+          <w:bCs/>
+        </w:rPr>
+      </w:pPr>
+      <w:r>
+        <w:rPr>
+          <w:b/>
+          <w:bCs/>
+        </w:rPr>
+        <w:t>Note that due to filtering algorithms, start and end parts of filtered data become distorted. The size of these parts depends on ‘Filter value’. Be cautious when applying in bathy processing. Consider some extra data on both ends of data range.</w:t>
+      </w:r>
+    </w:p>
+    <w:p>
+      <w:pPr>
+        <w:pStyle w:val="Heading1"/>
       </w:pPr>
       <w:r>
         <w:t>Settings saving</w:t>
@@ -1254,7 +1406,11 @@
         <w:t>Save</w:t>
       </w:r>
       <w:r>
-        <w:t>’ button. All data will be saved as single file. ‘Date’ and ‘Time’ formats are the same as in the source files. ‘Date’ and ‘Time’ fields will be separated by space, ‘Tide’ field will be separated by comma.</w:t>
+        <w:t xml:space="preserve">’ button. All data will be saved as single file. ‘Date’ </w:t>
+      </w:r>
+      <w:r>
+        <w:lastRenderedPageBreak/>
+        <w:t>and ‘Time’ formats are the same as in the source files. ‘Date’ and ‘Time’ fields will be separated by space, ‘Tide’ field will be separated by comma.</w:t>
       </w:r>
     </w:p>
     <w:sectPr>
@@ -2417,6 +2573,7 @@
   <w:style w:type="character" w:default="1" w:styleId="DefaultParagraphFont">
     <w:name w:val="Default Paragraph Font"/>
     <w:uiPriority w:val="1"/>
+    <w:semiHidden/>
     <w:unhideWhenUsed/>
   </w:style>
   <w:style w:type="table" w:default="1" w:styleId="TableNormal">

</xml_diff>